<commit_message>
Update resume and remove favicon
Updated Erick_Thamara_Resume.docx with new content and deleted the favicon.ico file from the public directory.
</commit_message>
<xml_diff>
--- a/public/Erick_Thamara_Resume.docx
+++ b/public/Erick_Thamara_Resume.docx
@@ -205,31 +205,25 @@
                 <w:szCs w:val="20"/>
               </w:rPr>
             </w:pPr>
+            <w:hyperlink r:id="rId7" w:history="1">
+              <w:r>
+                <w:rPr>
+                  <w:rStyle w:val="Hyperlink"/>
+                  <w:rFonts w:ascii="Tahoma" w:hAnsi="Tahoma" w:cs="Tahoma"/>
+                  <w:sz w:val="20"/>
+                  <w:szCs w:val="20"/>
+                </w:rPr>
+                <w:t>erickthamara9@gmail.com</w:t>
+              </w:r>
+            </w:hyperlink>
             <w:r>
               <w:rPr>
                 <w:rFonts w:ascii="Tahoma" w:hAnsi="Tahoma" w:cs="Tahoma"/>
-                <w:sz w:val="20"/>
-                <w:szCs w:val="20"/>
-              </w:rPr>
-              <w:t>erickthamara9@gmail.com</w:t>
-            </w:r>
-            <w:r>
-              <w:rPr>
-                <w:rFonts w:ascii="Tahoma" w:hAnsi="Tahoma" w:cs="Tahoma"/>
                 <w:color w:val="000000" w:themeColor="text1"/>
                 <w:sz w:val="20"/>
                 <w:szCs w:val="20"/>
               </w:rPr>
               <w:t xml:space="preserve"> </w:t>
-            </w:r>
-            <w:r>
-              <w:rPr>
-                <w:rFonts w:ascii="Tahoma" w:hAnsi="Tahoma" w:cs="Tahoma"/>
-                <w:color w:val="000000" w:themeColor="text1"/>
-                <w:sz w:val="20"/>
-                <w:szCs w:val="20"/>
-              </w:rPr>
-              <w:t xml:space="preserve">  </w:t>
             </w:r>
           </w:p>
           <w:p>
@@ -243,6 +237,17 @@
                 <w:szCs w:val="20"/>
               </w:rPr>
             </w:pPr>
+            <w:hyperlink r:id="rId8" w:history="1">
+              <w:r>
+                <w:rPr>
+                  <w:rStyle w:val="Hyperlink"/>
+                  <w:rFonts w:ascii="Tahoma" w:hAnsi="Tahoma" w:cs="Tahoma"/>
+                  <w:sz w:val="20"/>
+                  <w:szCs w:val="20"/>
+                </w:rPr>
+                <w:t>linkedin.com/in/erickthamara/</w:t>
+              </w:r>
+            </w:hyperlink>
             <w:r>
               <w:rPr>
                 <w:rFonts w:ascii="Tahoma" w:hAnsi="Tahoma" w:cs="Tahoma"/>
@@ -250,7 +255,7 @@
                 <w:sz w:val="20"/>
                 <w:szCs w:val="20"/>
               </w:rPr>
-              <w:t>linkedin.com/in/erickthamara/</w:t>
+              <w:t xml:space="preserve">  </w:t>
             </w:r>
           </w:p>
           <w:p>
@@ -258,30 +263,73 @@
               <w:spacing w:line="360" w:lineRule="auto"/>
               <w:jc w:val="right"/>
               <w:rPr>
-                <w:rFonts w:ascii="Lora" w:hAnsi="Lora"/>
-                <w:color w:val="000000" w:themeColor="text1"/>
-                <w:sz w:val="20"/>
-                <w:szCs w:val="20"/>
-              </w:rPr>
-            </w:pPr>
-            <w:r>
-              <w:rPr>
-                <w:rFonts w:ascii="Lora" w:hAnsi="Lora"/>
-                <w:color w:val="000000" w:themeColor="text1"/>
-                <w:sz w:val="20"/>
-                <w:szCs w:val="20"/>
-              </w:rPr>
-              <w:t>github.com/Erickthamara</w:t>
-            </w:r>
-            <w:r>
-              <w:rPr>
-                <w:rFonts w:ascii="Lora" w:hAnsi="Lora"/>
+                <w:rFonts w:ascii="Tahoma" w:hAnsi="Tahoma" w:cs="Tahoma"/>
+                <w:color w:val="000000" w:themeColor="text1"/>
+                <w:sz w:val="20"/>
+                <w:szCs w:val="20"/>
+              </w:rPr>
+            </w:pPr>
+            <w:hyperlink r:id="rId9" w:history="1">
+              <w:r>
+                <w:rPr>
+                  <w:rStyle w:val="Hyperlink"/>
+                  <w:rFonts w:ascii="Tahoma" w:hAnsi="Tahoma" w:cs="Tahoma"/>
+                  <w:sz w:val="20"/>
+                  <w:szCs w:val="20"/>
+                </w:rPr>
+                <w:t>github.com/Erickthamara</w:t>
+              </w:r>
+            </w:hyperlink>
+            <w:r>
+              <w:rPr>
+                <w:rFonts w:ascii="Tahoma" w:hAnsi="Tahoma" w:cs="Tahoma"/>
                 <w:color w:val="000000" w:themeColor="text1"/>
                 <w:sz w:val="20"/>
                 <w:szCs w:val="20"/>
               </w:rPr>
               <w:t xml:space="preserve"> </w:t>
             </w:r>
+          </w:p>
+          <w:p>
+            <w:pPr>
+              <w:spacing w:line="360" w:lineRule="auto"/>
+              <w:jc w:val="right"/>
+              <w:rPr>
+                <w:rFonts w:ascii="Lora" w:hAnsi="Lora"/>
+                <w:color w:val="000000" w:themeColor="text1"/>
+                <w:sz w:val="20"/>
+                <w:szCs w:val="20"/>
+              </w:rPr>
+            </w:pPr>
+            <w:hyperlink r:id="rId10" w:history="1">
+              <w:r>
+                <w:rPr>
+                  <w:rStyle w:val="Hyperlink"/>
+                  <w:rFonts w:ascii="Lora" w:hAnsi="Lora"/>
+                  <w:sz w:val="20"/>
+                  <w:szCs w:val="20"/>
+                </w:rPr>
+                <w:t>erickthamar</w:t>
+              </w:r>
+              <w:r>
+                <w:rPr>
+                  <w:rStyle w:val="Hyperlink"/>
+                  <w:rFonts w:ascii="Lora" w:hAnsi="Lora"/>
+                  <w:sz w:val="20"/>
+                  <w:szCs w:val="20"/>
+                </w:rPr>
+                <w:t>a</w:t>
+              </w:r>
+              <w:r>
+                <w:rPr>
+                  <w:rStyle w:val="Hyperlink"/>
+                  <w:rFonts w:ascii="Lora" w:hAnsi="Lora"/>
+                  <w:sz w:val="20"/>
+                  <w:szCs w:val="20"/>
+                </w:rPr>
+                <w:t>.com</w:t>
+              </w:r>
+            </w:hyperlink>
           </w:p>
         </w:tc>
         <w:tc>
@@ -3362,12 +3410,12 @@
       </w:pPr>
     </w:p>
     <w:sectPr>
-      <w:headerReference w:type="even" r:id="rId7"/>
-      <w:headerReference w:type="default" r:id="rId8"/>
-      <w:footerReference w:type="even" r:id="rId9"/>
-      <w:footerReference w:type="default" r:id="rId10"/>
-      <w:headerReference w:type="first" r:id="rId11"/>
-      <w:footerReference w:type="first" r:id="rId12"/>
+      <w:headerReference w:type="even" r:id="rId11"/>
+      <w:headerReference w:type="default" r:id="rId12"/>
+      <w:footerReference w:type="even" r:id="rId13"/>
+      <w:footerReference w:type="default" r:id="rId14"/>
+      <w:headerReference w:type="first" r:id="rId15"/>
+      <w:footerReference w:type="first" r:id="rId16"/>
       <w:pgSz w:w="12240" w:h="15840" w:code="1"/>
       <w:pgMar w:top="567" w:right="284" w:bottom="0" w:left="284" w:header="284" w:footer="0" w:gutter="0"/>
       <w:cols w:space="708"/>
@@ -6386,6 +6434,7 @@
   <w:style w:type="character" w:default="1" w:styleId="DefaultParagraphFont">
     <w:name w:val="Default Paragraph Font"/>
     <w:uiPriority w:val="1"/>
+    <w:semiHidden/>
     <w:unhideWhenUsed/>
   </w:style>
   <w:style w:type="table" w:default="1" w:styleId="TableNormal">
@@ -6521,6 +6570,18 @@
     <w:link w:val="Footer"/>
     <w:uiPriority w:val="99"/>
     <w:rsid w:val="004D5323"/>
+  </w:style>
+  <w:style w:type="character" w:styleId="FollowedHyperlink">
+    <w:name w:val="FollowedHyperlink"/>
+    <w:basedOn w:val="DefaultParagraphFont"/>
+    <w:uiPriority w:val="99"/>
+    <w:semiHidden/>
+    <w:unhideWhenUsed/>
+    <w:rsid w:val="00781C7B"/>
+    <w:rPr>
+      <w:color w:val="954F72" w:themeColor="followedHyperlink"/>
+      <w:u w:val="single"/>
+    </w:rPr>
   </w:style>
 </w:styles>
 </file>

</xml_diff>